<commit_message>
Factsheet search for the chatbot: chunks, keyword search, Mistral embeddings, evals
- Data job: splits each fund's factsheet page into layout-aware chunks (<= ~250 tokens) into
  published/factsheet_chunks.csv (all months kept); embeds new or changed chunks with
  mistral-embed into published/factsheet_embeddings.csv when MISTRAL_API_KEY is set.
- Chatbot: keyword (BM25) search with synonyms, filtered to the fund and month named in the
  question, runs before the first model call (top 3 extracts); search_factsheets tool for
  follow-ups; answers quote the extract and link the page, or say "not stated".
- Semantic and hybrid modes ready behind [settings.factsheet_search] mode (default keyword),
  falling back to keyword when Mistral fails.
- Evals: eval-search command and a 24-question test set from real factsheet pages.
- Spec updated.

Co-Authored-By: Claude Opus 5.5 <noreply@anthropic.com>
Claude-Session: https://claude.ai/code/session_01QNakvTP1ndy176uHZrw6sF
</commit_message>
<xml_diff>
--- a/Arbitrage Fund Analyser – v0 Spec.docx
+++ b/Arbitrage Fund Analyser – v0 Spec.docx
@@ -13,13 +13,7 @@
     <w:p>
       <w:pPr/>
       <w:r>
-        <w:t xml:space="preserve">Oct 7, 2026</w:t>
-      </w:r>
-      <w:r>
-        <w:t xml:space="preserve"> · </w:t>
-      </w:r>
-      <w:r>
-        <w:t xml:space="preserve">@Nikhil</w:t>
+        <w:t xml:space="preserve">Oct 7, 2026 · updated Oct 30, 2026 · @Nikhil</w:t>
       </w:r>
     </w:p>
     <w:p>
@@ -51,7 +45,7 @@
         <w:t xml:space="preserve">Users:</w:t>
       </w:r>
       <w:r>
-        <w:t xml:space="preserve"> internal only. Runs on one laptop.</w:t>
+        <w:t xml:space="preserve"> internal only. Runs on Streamlit Cloud (quantifiers-mutualfund-analysis.streamlit.app).</w:t>
       </w:r>
     </w:p>
     <w:p>
@@ -102,10 +96,28 @@
         <w:rPr>
           <w:b/>
         </w:rPr>
+        <w:t xml:space="preserve">Chatbot:</w:t>
+      </w:r>
+      <w:r>
+        <w:t xml:space="preserve"> “Ask the analyst” tab answers from stored data. Factsheet search is planned (see below).</w:t>
+      </w:r>
+    </w:p>
+    <w:p>
+      <w:pPr>
+        <w:pStyle w:val="ListParagraph"/>
+        <w:numPr>
+          <w:ilvl w:val="0"/>
+          <w:numId w:val="2"/>
+        </w:numPr>
+      </w:pPr>
+      <w:r>
+        <w:rPr>
+          <w:b/>
+        </w:rPr>
         <w:t xml:space="preserve">Later:</w:t>
       </w:r>
       <w:r>
-        <w:t xml:space="preserve"> other fund categories, external users, a chatbot. The design must not block these.</w:t>
+        <w:t xml:space="preserve"> other fund categories, external users. The design must not block these.</w:t>
       </w:r>
     </w:p>
     <w:p>
@@ -119,7 +131,7 @@
     <w:p>
       <w:pPr/>
       <w:r>
-        <w:t xml:space="preserve">All fund data comes from AMFI and is automated. Only the benchmark and two config fields are manual. The AMFI code links every dataset.</w:t>
+        <w:t xml:space="preserve">Fund data is fetched by a scheduled job and kept as CSV files in the repository. Only the benchmark and config fields are manual. The AMFI code links every dataset.</w:t>
       </w:r>
     </w:p>
     <w:tbl>
@@ -269,7 +281,7 @@
           <w:p>
             <w:pPr/>
             <w:r>
-              <w:t xml:space="preserve">Monthly</w:t>
+              <w:t xml:space="preserve">Daily job</w:t>
             </w:r>
           </w:p>
         </w:tc>
@@ -280,7 +292,7 @@
           <w:p>
             <w:pPr/>
             <w:r>
-              <w:t xml:space="preserve">Manual upload</w:t>
+              <w:t xml:space="preserve">Automated</w:t>
             </w:r>
           </w:p>
         </w:tc>
@@ -293,7 +305,7 @@
           <w:p>
             <w:pPr/>
             <w:r>
-              <w:t xml:space="preserve">Average AUM, scheme-wise</w:t>
+              <w:t xml:space="preserve">Factsheet values: AUM, AAUM, portfolio turnover, Direct BER</w:t>
             </w:r>
           </w:p>
         </w:tc>
@@ -303,14 +315,9 @@
           </w:tcPr>
           <w:p>
             <w:pPr/>
-            <w:hyperlink r:id="rId4" w:history="1">
-              <w:r>
-                <w:rPr>
-                  <w:rStyle w:val="Hyperlink"/>
-                </w:rPr>
-                <w:t xml:space="preserve">AMFI Average AUM page</w:t>
-              </w:r>
-            </w:hyperlink>
+            <w:r>
+              <w:t xml:space="preserve">AMC factsheet PDFs (fund page)</w:t>
+            </w:r>
           </w:p>
         </w:tc>
         <w:tc>
@@ -320,7 +327,7 @@
           <w:p>
             <w:pPr/>
             <w:r>
-              <w:t xml:space="preserve">Quarterly</w:t>
+              <w:t xml:space="preserve">Monthly (job on 12th, 18th, 25th)</w:t>
             </w:r>
           </w:p>
         </w:tc>
@@ -331,7 +338,7 @@
           <w:p>
             <w:pPr/>
             <w:r>
-              <w:t xml:space="preserve">Manual upload (Excel export)</w:t>
+              <w:t xml:space="preserve">Automated</w:t>
             </w:r>
           </w:p>
         </w:tc>
@@ -423,6 +430,52 @@
           <w:p>
             <w:pPr/>
             <w:r>
+              <w:t xml:space="preserve">Manual upload in the app, saved to GitHub</w:t>
+            </w:r>
+          </w:p>
+        </w:tc>
+      </w:tr>
+      <w:tr>
+        <w:tc>
+          <w:tcPr>
+            <w:tcW w:w="2340" w:type="dxa"/>
+          </w:tcPr>
+          <w:p>
+            <w:pPr/>
+            <w:r>
+              <w:t xml:space="preserve">Exit load, fund manager</w:t>
+            </w:r>
+          </w:p>
+        </w:tc>
+        <w:tc>
+          <w:tcPr>
+            <w:tcW w:w="2340" w:type="dxa"/>
+          </w:tcPr>
+          <w:p>
+            <w:pPr/>
+            <w:r>
+              <w:t xml:space="preserve">Config file</w:t>
+            </w:r>
+          </w:p>
+        </w:tc>
+        <w:tc>
+          <w:tcPr>
+            <w:tcW w:w="2340" w:type="dxa"/>
+          </w:tcPr>
+          <w:p>
+            <w:pPr/>
+            <w:r>
+              <w:t xml:space="preserve">On change</w:t>
+            </w:r>
+          </w:p>
+        </w:tc>
+        <w:tc>
+          <w:tcPr>
+            <w:tcW w:w="2340" w:type="dxa"/>
+          </w:tcPr>
+          <w:p>
+            <w:pPr/>
+            <w:r>
               <w:t xml:space="preserve">Manual</w:t>
             </w:r>
           </w:p>
@@ -436,7 +489,7 @@
           <w:p>
             <w:pPr/>
             <w:r>
-              <w:t xml:space="preserve">Exit load, fund manager</w:t>
+              <w:t xml:space="preserve">Fund list, category and AMFI codes</w:t>
             </w:r>
           </w:p>
         </w:tc>
@@ -458,7 +511,7 @@
           <w:p>
             <w:pPr/>
             <w:r>
-              <w:t xml:space="preserve">On change</w:t>
+              <w:t xml:space="preserve">One-time</w:t>
             </w:r>
           </w:p>
         </w:tc>
@@ -474,52 +527,6 @@
           </w:p>
         </w:tc>
       </w:tr>
-      <w:tr>
-        <w:tc>
-          <w:tcPr>
-            <w:tcW w:w="2340" w:type="dxa"/>
-          </w:tcPr>
-          <w:p>
-            <w:pPr/>
-            <w:r>
-              <w:t xml:space="preserve">Fund list, category and AMFI codes</w:t>
-            </w:r>
-          </w:p>
-        </w:tc>
-        <w:tc>
-          <w:tcPr>
-            <w:tcW w:w="2340" w:type="dxa"/>
-          </w:tcPr>
-          <w:p>
-            <w:pPr/>
-            <w:r>
-              <w:t xml:space="preserve">Config file</w:t>
-            </w:r>
-          </w:p>
-        </w:tc>
-        <w:tc>
-          <w:tcPr>
-            <w:tcW w:w="2340" w:type="dxa"/>
-          </w:tcPr>
-          <w:p>
-            <w:pPr/>
-            <w:r>
-              <w:t xml:space="preserve">One-time</w:t>
-            </w:r>
-          </w:p>
-        </w:tc>
-        <w:tc>
-          <w:tcPr>
-            <w:tcW w:w="2340" w:type="dxa"/>
-          </w:tcPr>
-          <w:p>
-            <w:pPr/>
-            <w:r>
-              <w:t xml:space="preserve">Manual</w:t>
-            </w:r>
-          </w:p>
-        </w:tc>
-      </w:tr>
     </w:tbl>
     <w:p>
       <w:pPr>
@@ -530,7 +537,7 @@
         </w:numPr>
       </w:pPr>
       <w:r>
-        <w:t xml:space="preserve">AMFI AAUM is in Rs lakhs. Store in Rs crore.</w:t>
+        <w:t xml:space="preserve">Factsheet AUM and AAUM are in Rs crore. A value the factsheet does not print is left blank, never guessed.</w:t>
       </w:r>
     </w:p>
     <w:p>
@@ -554,7 +561,19 @@
         </w:numPr>
       </w:pPr>
       <w:r>
-        <w:t xml:space="preserve">Resolved during build: AMFI's NAV history allows only 90 days per download, so NAV comes from mfapi.in, with code, ISIN and plan checked each refresh. No AMFI API for TER and AAUM could be verified, so both are file uploads.</w:t>
+        <w:t xml:space="preserve">Resolved during build: AMFI’s NAV history allows only 90 days per download, so NAV comes from mfapi.in, with code, ISIN and plan checked each refresh. TER comes from the data behind the AMFI TER page (Direct Plan). AAUM now comes from factsheets, not the AMFI quarterly file.</w:t>
+      </w:r>
+    </w:p>
+    <w:p>
+      <w:pPr>
+        <w:pStyle w:val="ListParagraph"/>
+        <w:numPr>
+          <w:ilvl w:val="0"/>
+          <w:numId w:val="3"/>
+        </w:numPr>
+      </w:pPr>
+      <w:r>
+        <w:t xml:space="preserve">Known gap: AMFI shows no TER rows for ICICI, SBI and Invesco at present (checked on the AMFI site).</w:t>
       </w:r>
     </w:p>
     <w:p>
@@ -947,29 +966,134 @@
           <w:p>
             <w:pPr/>
             <w:r>
-              <w:t xml:space="preserve">AUM, TER</w:t>
-            </w:r>
-          </w:p>
-        </w:tc>
-        <w:tc>
-          <w:tcPr>
-            <w:tcW w:w="3120" w:type="dxa"/>
-          </w:tcPr>
-          <w:p>
-            <w:pPr/>
-            <w:r>
-              <w:t xml:space="preserve">Units</w:t>
-            </w:r>
-          </w:p>
-        </w:tc>
-        <w:tc>
-          <w:tcPr>
-            <w:tcW w:w="3120" w:type="dxa"/>
-          </w:tcPr>
-          <w:p>
-            <w:pPr/>
-            <w:r>
-              <w:t xml:space="preserve">AMFI AAUM in Rs lakhs → store in Rs crore</w:t>
+              <w:t xml:space="preserve">Factsheet values</w:t>
+            </w:r>
+          </w:p>
+        </w:tc>
+        <w:tc>
+          <w:tcPr>
+            <w:tcW w:w="3120" w:type="dxa"/>
+          </w:tcPr>
+          <w:p>
+            <w:pPr/>
+            <w:r>
+              <w:t xml:space="preserve">Ranges</w:t>
+            </w:r>
+          </w:p>
+        </w:tc>
+        <w:tc>
+          <w:tcPr>
+            <w:tcW w:w="3120" w:type="dxa"/>
+          </w:tcPr>
+          <w:p>
+            <w:pPr/>
+            <w:r>
+              <w:t xml:space="preserve">AUM, AAUM above 0 and up to 10 lakh Cr; BER above 0 and up to 2.5% → else not stored</w:t>
+            </w:r>
+          </w:p>
+        </w:tc>
+      </w:tr>
+      <w:tr>
+        <w:tc>
+          <w:tcPr>
+            <w:tcW w:w="3120" w:type="dxa"/>
+          </w:tcPr>
+          <w:p>
+            <w:pPr/>
+            <w:r>
+              <w:t xml:space="preserve">Factsheet values</w:t>
+            </w:r>
+          </w:p>
+        </w:tc>
+        <w:tc>
+          <w:tcPr>
+            <w:tcW w:w="3120" w:type="dxa"/>
+          </w:tcPr>
+          <w:p>
+            <w:pPr/>
+            <w:r>
+              <w:t xml:space="preserve">AAUM vs AUM</w:t>
+            </w:r>
+          </w:p>
+        </w:tc>
+        <w:tc>
+          <w:tcPr>
+            <w:tcW w:w="3120" w:type="dxa"/>
+          </w:tcPr>
+          <w:p>
+            <w:pPr/>
+            <w:r>
+              <w:t xml:space="preserve">AAUM outside 0.5–2× AUM → flag</w:t>
+            </w:r>
+          </w:p>
+        </w:tc>
+      </w:tr>
+      <w:tr>
+        <w:tc>
+          <w:tcPr>
+            <w:tcW w:w="3120" w:type="dxa"/>
+          </w:tcPr>
+          <w:p>
+            <w:pPr/>
+            <w:r>
+              <w:t xml:space="preserve">Factsheet values</w:t>
+            </w:r>
+          </w:p>
+        </w:tc>
+        <w:tc>
+          <w:tcPr>
+            <w:tcW w:w="3120" w:type="dxa"/>
+          </w:tcPr>
+          <w:p>
+            <w:pPr/>
+            <w:r>
+              <w:t xml:space="preserve">BER vs AMFI</w:t>
+            </w:r>
+          </w:p>
+        </w:tc>
+        <w:tc>
+          <w:tcPr>
+            <w:tcW w:w="3120" w:type="dxa"/>
+          </w:tcPr>
+          <w:p>
+            <w:pPr/>
+            <w:r>
+              <w:t xml:space="preserve">Factsheet Direct BER more than 0.02% from AMFI BER, with and without 18% GST → flag</w:t>
+            </w:r>
+          </w:p>
+        </w:tc>
+      </w:tr>
+      <w:tr>
+        <w:tc>
+          <w:tcPr>
+            <w:tcW w:w="3120" w:type="dxa"/>
+          </w:tcPr>
+          <w:p>
+            <w:pPr/>
+            <w:r>
+              <w:t xml:space="preserve">Factsheet values</w:t>
+            </w:r>
+          </w:p>
+        </w:tc>
+        <w:tc>
+          <w:tcPr>
+            <w:tcW w:w="3120" w:type="dxa"/>
+          </w:tcPr>
+          <w:p>
+            <w:pPr/>
+            <w:r>
+              <w:t xml:space="preserve">Same month read again</w:t>
+            </w:r>
+          </w:p>
+        </w:tc>
+        <w:tc>
+          <w:tcPr>
+            <w:tcW w:w="3120" w:type="dxa"/>
+          </w:tcPr>
+          <w:p>
+            <w:pPr/>
+            <w:r>
+              <w:t xml:space="preserve">Changed values reported; a new read that lacks a stored value is not used</w:t>
             </w:r>
           </w:p>
         </w:tc>
@@ -1290,7 +1414,7 @@
           <w:p>
             <w:pPr/>
             <w:r>
-              <w:t xml:space="preserve">Base and total TER, latest and trend</w:t>
+              <w:t xml:space="preserve">BER and total TER from AMFI, latest; Direct BER from the factsheet alongside</w:t>
             </w:r>
           </w:p>
         </w:tc>
@@ -1314,7 +1438,7 @@
           <w:p>
             <w:pPr/>
             <w:r>
-              <w:t xml:space="preserve">Latest quarterly AAUM, in Rs crore</w:t>
+              <w:t xml:space="preserve">Month-end AUM and monthly AAUM from the latest factsheet, in Rs crore</w:t>
             </w:r>
           </w:p>
         </w:tc>
@@ -1355,7 +1479,7 @@
     <w:p>
       <w:pPr/>
       <w:r>
-        <w:t xml:space="preserve">v0 has three screens. Every table can be sorted and exported to CSV.</w:t>
+        <w:t xml:space="preserve">v0 has four screens. Every table can be sorted and exported to CSV.</w:t>
       </w:r>
     </w:p>
     <w:p>
@@ -1415,7 +1539,7 @@
         </w:numPr>
       </w:pPr>
       <w:r>
-        <w:t xml:space="preserve">One row per fund: AUM, base TER, total TER, exit load, manager, launch date.</w:t>
+        <w:t xml:space="preserve">One row per fund: NAV, AUM, AAUM, BER (AMFI and factsheet), total TER, turnover, exit load, manager, launch date, links to the factsheet and monthly portfolio.</w:t>
       </w:r>
     </w:p>
     <w:p>
@@ -1565,7 +1689,31 @@
         </w:numPr>
       </w:pPr>
       <w:r>
-        <w:t xml:space="preserve">Benchmark CSV upload button.</w:t>
+        <w:t xml:space="preserve">Benchmark CSV upload, saved to GitHub.</w:t>
+      </w:r>
+    </w:p>
+    <w:p>
+      <w:pPr>
+        <w:pStyle w:val="ListParagraph"/>
+        <w:numPr>
+          <w:ilvl w:val="0"/>
+          <w:numId w:val="9"/>
+        </w:numPr>
+      </w:pPr>
+      <w:r>
+        <w:t xml:space="preserve">Mark flags reviewed, saved to GitHub.</w:t>
+      </w:r>
+    </w:p>
+    <w:p>
+      <w:pPr>
+        <w:pStyle w:val="ListParagraph"/>
+        <w:numPr>
+          <w:ilvl w:val="0"/>
+          <w:numId w:val="9"/>
+        </w:numPr>
+      </w:pPr>
+      <w:r>
+        <w:t xml:space="preserve">Link to run the data job by hand.</w:t>
       </w:r>
     </w:p>
     <w:p>
@@ -1574,7 +1722,64 @@
         <w:rPr>
           <w:b/>
         </w:rPr>
-        <w:t xml:space="preserve">Daily refresh</w:t>
+        <w:t xml:space="preserve">4. Ask the analyst</w:t>
+      </w:r>
+    </w:p>
+    <w:p>
+      <w:pPr>
+        <w:pStyle w:val="ListParagraph"/>
+        <w:numPr>
+          <w:ilvl w:val="0"/>
+          <w:numId w:val="9"/>
+        </w:numPr>
+      </w:pPr>
+      <w:r>
+        <w:t xml:space="preserve">Chat about the funds. The model calls tools over stored data: list funds, compare funds, returns, rolling return stats, NAV history, data status.</w:t>
+      </w:r>
+    </w:p>
+    <w:p>
+      <w:pPr>
+        <w:pStyle w:val="ListParagraph"/>
+        <w:numPr>
+          <w:ilvl w:val="0"/>
+          <w:numId w:val="9"/>
+        </w:numPr>
+      </w:pPr>
+      <w:r>
+        <w:t xml:space="preserve">Answers use only tool results; no data from the model’s own memory.</w:t>
+      </w:r>
+    </w:p>
+    <w:p>
+      <w:pPr>
+        <w:pStyle w:val="ListParagraph"/>
+        <w:numPr>
+          <w:ilvl w:val="0"/>
+          <w:numId w:val="9"/>
+        </w:numPr>
+      </w:pPr>
+      <w:r>
+        <w:t xml:space="preserve">Model set in Streamlit secrets: Gemini by default; Claude or any OpenAI-compatible API (e.g. Groq gpt-oss-120b) supported.</w:t>
+      </w:r>
+    </w:p>
+    <w:p>
+      <w:pPr>
+        <w:pStyle w:val="ListParagraph"/>
+        <w:numPr>
+          <w:ilvl w:val="0"/>
+          <w:numId w:val="9"/>
+        </w:numPr>
+      </w:pPr>
+      <w:r>
+        <w:t xml:space="preserve">Searches the factsheet text (below) before the first model call; a search_factsheets tool covers other wording, funds or months.</w:t>
+      </w:r>
+    </w:p>
+    <w:p>
+      <w:pPr/>
+      <w:r>
+        <w:rPr>
+          <w:b/>
+        </w:rPr>
+        <w:t xml:space="preserve">Data refresh (GitHub Actions job)</w:t>
       </w:r>
     </w:p>
     <w:p>
@@ -1586,7 +1791,7 @@
         </w:numPr>
       </w:pPr>
       <w:r>
-        <w:t xml:space="preserve">One script pulls new NAV each day; TER monthly; AUM quarterly.</w:t>
+        <w:t xml:space="preserve">NAV and TER: every weekday, 03:15 IST.</w:t>
       </w:r>
     </w:p>
     <w:p>
@@ -1598,7 +1803,55 @@
         </w:numPr>
       </w:pPr>
       <w:r>
+        <w:t xml:space="preserve">Factsheets: 12th, 18th and 25th of each month, 09:00 IST (with NAV and TER).</w:t>
+      </w:r>
+    </w:p>
+    <w:p>
+      <w:pPr>
+        <w:pStyle w:val="ListParagraph"/>
+        <w:numPr>
+          <w:ilvl w:val="0"/>
+          <w:numId w:val="10"/>
+        </w:numPr>
+      </w:pPr>
+      <w:r>
+        <w:t xml:space="preserve">Can also be run by hand from GitHub Actions.</w:t>
+      </w:r>
+    </w:p>
+    <w:p>
+      <w:pPr>
+        <w:pStyle w:val="ListParagraph"/>
+        <w:numPr>
+          <w:ilvl w:val="0"/>
+          <w:numId w:val="10"/>
+        </w:numPr>
+      </w:pPr>
+      <w:r>
         <w:t xml:space="preserve">Missed days are caught up on the next run.</w:t>
+      </w:r>
+    </w:p>
+    <w:p>
+      <w:pPr>
+        <w:pStyle w:val="ListParagraph"/>
+        <w:numPr>
+          <w:ilvl w:val="0"/>
+          <w:numId w:val="10"/>
+        </w:numPr>
+      </w:pPr>
+      <w:r>
+        <w:t xml:space="preserve">The job commits only its own files (funds, nav, ter, factsheet values); the app commits only benchmark and reviewed flags, so they never overwrite each other.</w:t>
+      </w:r>
+    </w:p>
+    <w:p>
+      <w:pPr>
+        <w:pStyle w:val="ListParagraph"/>
+        <w:numPr>
+          <w:ilvl w:val="0"/>
+          <w:numId w:val="10"/>
+        </w:numPr>
+      </w:pPr>
+      <w:r>
+        <w:t xml:space="preserve">The job shows as failed when there are errors or new flags, so they get seen.</w:t>
       </w:r>
     </w:p>
     <w:p>
@@ -1764,7 +2017,7 @@
     <w:p>
       <w:pPr/>
       <w:r>
-        <w:t xml:space="preserve">Python, pandas and Streamlit, with one SQLite file on the laptop.</w:t>
+        <w:t xml:space="preserve">Python, pandas and Streamlit, on Streamlit Cloud. Data kept as CSV files in the GitHub repository.</w:t>
       </w:r>
     </w:p>
     <w:p>
@@ -1797,10 +2050,10 @@
         <w:rPr>
           <w:b/>
         </w:rPr>
-        <w:t xml:space="preserve">Storage:</w:t>
-      </w:r>
-      <w:r>
-        <w:t xml:space="preserve"> SQLite file. 8 funds, 5+ years is about 1 to 2 MB. No server, no setup.</w:t>
+        <w:t xml:space="preserve">Data store:</w:t>
+      </w:r>
+      <w:r>
+        <w:t xml:space="preserve"> CSV files in published/ (funds, nav, ter, benchmark, factsheet values, reviewed flags) are the source of truth. One row per key, sorted, so a change shows as a small diff.</w:t>
       </w:r>
     </w:p>
     <w:p>
@@ -1815,10 +2068,10 @@
         <w:rPr>
           <w:b/>
         </w:rPr>
-        <w:t xml:space="preserve">Tables:</w:t>
-      </w:r>
-      <w:r>
-        <w:t xml:space="preserve"> funds, nav, benchmark, ter, aum, validation_log.</w:t>
+        <w:t xml:space="preserve">Database:</w:t>
+      </w:r>
+      <w:r>
+        <w:t xml:space="preserve"> SQLite, a cache rebuilt from the CSV files when the app starts or a file changes.</w:t>
       </w:r>
     </w:p>
     <w:p>
@@ -1833,10 +2086,10 @@
         <w:rPr>
           <w:b/>
         </w:rPr>
-        <w:t xml:space="preserve">Backup:</w:t>
-      </w:r>
-      <w:r>
-        <w:t xml:space="preserve"> copy the .db file to Google Drive weekly.</w:t>
+        <w:t xml:space="preserve">Saves from the app:</w:t>
+      </w:r>
+      <w:r>
+        <w:t xml:space="preserve"> through the GitHub API with the GITHUB_TOKEN secret. A save never overwrites a newer version; a failed save is undone.</w:t>
       </w:r>
     </w:p>
     <w:p>
@@ -1851,10 +2104,46 @@
         <w:rPr>
           <w:b/>
         </w:rPr>
+        <w:t xml:space="preserve">Backup and history:</w:t>
+      </w:r>
+      <w:r>
+        <w:t xml:space="preserve"> the repository’s git history.</w:t>
+      </w:r>
+    </w:p>
+    <w:p>
+      <w:pPr>
+        <w:pStyle w:val="ListParagraph"/>
+        <w:numPr>
+          <w:ilvl w:val="0"/>
+          <w:numId w:val="11"/>
+        </w:numPr>
+      </w:pPr>
+      <w:r>
+        <w:rPr>
+          <w:b/>
+        </w:rPr>
+        <w:t xml:space="preserve">Secrets:</w:t>
+      </w:r>
+      <w:r>
+        <w:t xml:space="preserve"> GITHUB_TOKEN, chatbot model key, Mistral key (for factsheet search).</w:t>
+      </w:r>
+    </w:p>
+    <w:p>
+      <w:pPr>
+        <w:pStyle w:val="ListParagraph"/>
+        <w:numPr>
+          <w:ilvl w:val="0"/>
+          <w:numId w:val="11"/>
+        </w:numPr>
+      </w:pPr>
+      <w:r>
+        <w:rPr>
+          <w:b/>
+        </w:rPr>
         <w:t xml:space="preserve">Later:</w:t>
       </w:r>
       <w:r>
-        <w:t xml:space="preserve"> FastAPI over the module when a second consumer appears. Postgres and a cloud server when others need access.</w:t>
+        <w:t xml:space="preserve"> FastAPI over the module when a second consumer appears. Postgres when data or users outgrow CSV files.</w:t>
       </w:r>
     </w:p>
     <w:p>
@@ -1862,6 +2151,701 @@
         <w:pStyle w:val="Heading2"/>
       </w:pPr>
       <w:r>
+        <w:t xml:space="preserve">Factsheet search for the chatbot (phase 1 built)</w:t>
+      </w:r>
+    </w:p>
+    <w:p>
+      <w:pPr/>
+      <w:r>
+        <w:t xml:space="preserve">Lets the chatbot answer questions only the factsheet text answers, for example “does this fund use derivatives?”. Answers quote the factsheet and link the page.</w:t>
+      </w:r>
+    </w:p>
+    <w:p>
+      <w:pPr/>
+      <w:r>
+        <w:rPr>
+          <w:b/>
+        </w:rPr>
+        <w:t xml:space="preserve">Scope</w:t>
+      </w:r>
+    </w:p>
+    <w:p>
+      <w:pPr>
+        <w:pStyle w:val="ListParagraph"/>
+        <w:numPr>
+          <w:ilvl w:val="0"/>
+          <w:numId w:val="7"/>
+        </w:numPr>
+      </w:pPr>
+      <w:r>
+        <w:t xml:space="preserve">Fund page only, for each fund. Portfolio pages later.</w:t>
+      </w:r>
+    </w:p>
+    <w:p>
+      <w:pPr>
+        <w:pStyle w:val="ListParagraph"/>
+        <w:numPr>
+          <w:ilvl w:val="0"/>
+          <w:numId w:val="7"/>
+        </w:numPr>
+      </w:pPr>
+      <w:r>
+        <w:t xml:space="preserve">All months kept, so historical questions work (“what did it say in August?”). Latest month by default.</w:t>
+      </w:r>
+    </w:p>
+    <w:p>
+      <w:pPr/>
+      <w:r>
+        <w:rPr>
+          <w:b/>
+        </w:rPr>
+        <w:t xml:space="preserve">Chunks</w:t>
+      </w:r>
+    </w:p>
+    <w:p>
+      <w:pPr>
+        <w:pStyle w:val="ListParagraph"/>
+        <w:numPr>
+          <w:ilvl w:val="0"/>
+          <w:numId w:val="7"/>
+        </w:numPr>
+      </w:pPr>
+      <w:r>
+        <w:rPr>
+          <w:b/>
+        </w:rPr>
+        <w:t xml:space="preserve">Layout-aware:</w:t>
+      </w:r>
+      <w:r>
+        <w:t xml:space="preserve"> split by column and section heading, so a label stays with its value.</w:t>
+      </w:r>
+    </w:p>
+    <w:p>
+      <w:pPr>
+        <w:pStyle w:val="ListParagraph"/>
+        <w:numPr>
+          <w:ilvl w:val="0"/>
+          <w:numId w:val="7"/>
+        </w:numPr>
+      </w:pPr>
+      <w:r>
+        <w:rPr>
+          <w:b/>
+        </w:rPr>
+        <w:t xml:space="preserve">Size cap:</w:t>
+      </w:r>
+      <w:r>
+        <w:t xml:space="preserve"> about 250 tokens (200–300). A longer section is split with 1–2 lines of overlap. Plain fixed-size split only when the layout cannot be read.</w:t>
+      </w:r>
+    </w:p>
+    <w:p>
+      <w:pPr>
+        <w:pStyle w:val="ListParagraph"/>
+        <w:numPr>
+          <w:ilvl w:val="0"/>
+          <w:numId w:val="7"/>
+        </w:numPr>
+      </w:pPr>
+      <w:r>
+        <w:rPr>
+          <w:b/>
+        </w:rPr>
+        <w:t xml:space="preserve">Each chunk keeps:</w:t>
+      </w:r>
+      <w:r>
+        <w:t xml:space="preserve"> fund, AMC, as-of month, page, section, PDF link, text hash, embedding model.</w:t>
+      </w:r>
+    </w:p>
+    <w:p>
+      <w:pPr>
+        <w:pStyle w:val="ListParagraph"/>
+        <w:numPr>
+          <w:ilvl w:val="0"/>
+          <w:numId w:val="7"/>
+        </w:numPr>
+      </w:pPr>
+      <w:r>
+        <w:t xml:space="preserve">Built by the factsheet job (12th, 18th, 25th) into published/factsheet_chunks.csv; embeddings into published/factsheet_embeddings.csv.</w:t>
+      </w:r>
+    </w:p>
+    <w:p>
+      <w:pPr/>
+      <w:r>
+        <w:rPr>
+          <w:b/>
+        </w:rPr>
+        <w:t xml:space="preserve">Search, phase 1: keyword</w:t>
+      </w:r>
+    </w:p>
+    <w:p>
+      <w:pPr>
+        <w:pStyle w:val="ListParagraph"/>
+        <w:numPr>
+          <w:ilvl w:val="0"/>
+          <w:numId w:val="7"/>
+        </w:numPr>
+      </w:pPr>
+      <w:r>
+        <w:t xml:space="preserve">Keyword search (BM25), filtered to the fund and month first. Fund found by AMC name in the question; month by name (“in August” = data as of 31-Aug); else each fund’s latest month.</w:t>
+      </w:r>
+    </w:p>
+    <w:p>
+      <w:pPr>
+        <w:pStyle w:val="ListParagraph"/>
+        <w:numPr>
+          <w:ilvl w:val="0"/>
+          <w:numId w:val="7"/>
+        </w:numPr>
+      </w:pPr>
+      <w:r>
+        <w:t xml:space="preserve">Fund and AMC names are not counted as matches (they would favour chunks that print the fund name).</w:t>
+      </w:r>
+    </w:p>
+    <w:p>
+      <w:pPr>
+        <w:pStyle w:val="ListParagraph"/>
+        <w:numPr>
+          <w:ilvl w:val="0"/>
+          <w:numId w:val="7"/>
+        </w:numPr>
+      </w:pPr>
+      <w:r>
+        <w:t xml:space="preserve">Small synonym list, e.g. derivative ↔ futures ↔ hedge.</w:t>
+      </w:r>
+    </w:p>
+    <w:p>
+      <w:pPr>
+        <w:pStyle w:val="ListParagraph"/>
+        <w:numPr>
+          <w:ilvl w:val="0"/>
+          <w:numId w:val="7"/>
+        </w:numPr>
+      </w:pPr>
+      <w:r>
+        <w:t xml:space="preserve">Runs before the first model call: top 3 chunks sent with the question (about 750 tokens at most); the tool returns up to 5 (about 1,500 tokens). Keeps each call within free-tier token limits (e.g. Groq about 8K tokens per minute).</w:t>
+      </w:r>
+    </w:p>
+    <w:p>
+      <w:pPr>
+        <w:pStyle w:val="ListParagraph"/>
+        <w:numPr>
+          <w:ilvl w:val="0"/>
+          <w:numId w:val="7"/>
+        </w:numPr>
+      </w:pPr>
+      <w:r>
+        <w:t xml:space="preserve">Below a score threshold, the answer is “not stated in the factsheet”.</w:t>
+      </w:r>
+    </w:p>
+    <w:p>
+      <w:pPr/>
+      <w:r>
+        <w:rPr>
+          <w:b/>
+        </w:rPr>
+        <w:t xml:space="preserve">Search, phase 2: semantic</w:t>
+      </w:r>
+    </w:p>
+    <w:p>
+      <w:pPr>
+        <w:pStyle w:val="ListParagraph"/>
+        <w:numPr>
+          <w:ilvl w:val="0"/>
+          <w:numId w:val="7"/>
+        </w:numPr>
+      </w:pPr>
+      <w:r>
+        <w:t xml:space="preserve">Embeddings made with Mistral (mistral-embed) by the data job when the MISTRAL_API_KEY repository secret is set; re-made only for changed chunks (text hash).</w:t>
+      </w:r>
+    </w:p>
+    <w:p>
+      <w:pPr>
+        <w:pStyle w:val="ListParagraph"/>
+        <w:numPr>
+          <w:ilvl w:val="0"/>
+          <w:numId w:val="7"/>
+        </w:numPr>
+      </w:pPr>
+      <w:r>
+        <w:t xml:space="preserve">Phase 2: set [settings.factsheet_search] mode to semantic or hybrid (needs MISTRAL_API_KEY in the app’s secrets), only if the evals show it is better.</w:t>
+      </w:r>
+    </w:p>
+    <w:p>
+      <w:pPr>
+        <w:pStyle w:val="ListParagraph"/>
+        <w:numPr>
+          <w:ilvl w:val="0"/>
+          <w:numId w:val="7"/>
+        </w:numPr>
+      </w:pPr>
+      <w:r>
+        <w:t xml:space="preserve">If Mistral fails, search falls back to keyword.</w:t>
+      </w:r>
+    </w:p>
+    <w:p>
+      <w:pPr>
+        <w:pStyle w:val="ListParagraph"/>
+        <w:numPr>
+          <w:ilvl w:val="0"/>
+          <w:numId w:val="7"/>
+        </w:numPr>
+      </w:pPr>
+      <w:r>
+        <w:t xml:space="preserve">Mistral free tier: turn off training on our data in its admin settings.</w:t>
+      </w:r>
+    </w:p>
+    <w:p>
+      <w:pPr/>
+      <w:r>
+        <w:rPr>
+          <w:b/>
+        </w:rPr>
+        <w:t xml:space="preserve">Answers</w:t>
+      </w:r>
+    </w:p>
+    <w:p>
+      <w:pPr>
+        <w:pStyle w:val="ListParagraph"/>
+        <w:numPr>
+          <w:ilvl w:val="0"/>
+          <w:numId w:val="7"/>
+        </w:numPr>
+      </w:pPr>
+      <w:r>
+        <w:t xml:space="preserve">Quote the chunk used and link the factsheet page.</w:t>
+      </w:r>
+    </w:p>
+    <w:p>
+      <w:pPr>
+        <w:pStyle w:val="ListParagraph"/>
+        <w:numPr>
+          <w:ilvl w:val="0"/>
+          <w:numId w:val="7"/>
+        </w:numPr>
+      </w:pPr>
+      <w:r>
+        <w:t xml:space="preserve">Log the chunks found for each question, for review.</w:t>
+      </w:r>
+    </w:p>
+    <w:p>
+      <w:pPr>
+        <w:pStyle w:val="Heading2"/>
+      </w:pPr>
+      <w:r>
+        <w:t xml:space="preserve">Evals for factsheet search</w:t>
+      </w:r>
+    </w:p>
+    <w:p>
+      <w:pPr/>
+      <w:r>
+        <w:t xml:space="preserve">A small test set checks search and answers against the PDF, before and after semantic search.</w:t>
+      </w:r>
+    </w:p>
+    <w:p>
+      <w:pPr>
+        <w:pStyle w:val="ListParagraph"/>
+        <w:numPr>
+          <w:ilvl w:val="0"/>
+          <w:numId w:val="7"/>
+        </w:numPr>
+      </w:pPr>
+      <w:r>
+        <w:rPr>
+          <w:b/>
+        </w:rPr>
+        <w:t xml:space="preserve">Test set:</w:t>
+      </w:r>
+      <w:r>
+        <w:t xml:space="preserve"> about 20 questions across the funds. Each has the known answer chunk and the answer as printed in the PDF (fund, month, page).</w:t>
+      </w:r>
+    </w:p>
+    <w:p>
+      <w:pPr>
+        <w:pStyle w:val="ListParagraph"/>
+        <w:numPr>
+          <w:ilvl w:val="0"/>
+          <w:numId w:val="7"/>
+        </w:numPr>
+      </w:pPr>
+      <w:r>
+        <w:rPr>
+          <w:b/>
+        </w:rPr>
+        <w:t xml:space="preserve">Mix:</w:t>
+      </w:r>
+      <w:r>
+        <w:t xml:space="preserve"> direct values (AUM, BER, turnover); yes/no (derivatives, hedging); wording that differs from the PDF; past months; 2–3 with no answer in the factsheet.</w:t>
+      </w:r>
+    </w:p>
+    <w:p>
+      <w:pPr>
+        <w:pStyle w:val="ListParagraph"/>
+        <w:numPr>
+          <w:ilvl w:val="0"/>
+          <w:numId w:val="7"/>
+        </w:numPr>
+      </w:pPr>
+      <w:r>
+        <w:rPr>
+          <w:b/>
+        </w:rPr>
+        <w:t xml:space="preserve">Search score:</w:t>
+      </w:r>
+      <w:r>
+        <w:t xml:space="preserve"> answer chunk ranked first, and in the top 3.</w:t>
+      </w:r>
+    </w:p>
+    <w:p>
+      <w:pPr>
+        <w:pStyle w:val="ListParagraph"/>
+        <w:numPr>
+          <w:ilvl w:val="0"/>
+          <w:numId w:val="7"/>
+        </w:numPr>
+      </w:pPr>
+      <w:r>
+        <w:rPr>
+          <w:b/>
+        </w:rPr>
+        <w:t xml:space="preserve">Answer score:</w:t>
+      </w:r>
+      <w:r>
+        <w:t xml:space="preserve"> matches the PDF value or wording; says “not stated” when the factsheet has no answer; no made-up values.</w:t>
+      </w:r>
+    </w:p>
+    <w:p>
+      <w:pPr>
+        <w:pStyle w:val="ListParagraph"/>
+        <w:numPr>
+          <w:ilvl w:val="0"/>
+          <w:numId w:val="7"/>
+        </w:numPr>
+      </w:pPr>
+      <w:r>
+        <w:rPr>
+          <w:b/>
+        </w:rPr>
+        <w:t xml:space="preserve">Runs:</w:t>
+      </w:r>
+      <w:r>
+        <w:t xml:space="preserve"> keyword search first (baseline), then semantic and hybrid. Switch only when better.</w:t>
+      </w:r>
+    </w:p>
+    <w:p>
+      <w:pPr>
+        <w:pStyle w:val="ListParagraph"/>
+        <w:numPr>
+          <w:ilvl w:val="0"/>
+          <w:numId w:val="7"/>
+        </w:numPr>
+      </w:pPr>
+      <w:r>
+        <w:rPr>
+          <w:b/>
+        </w:rPr>
+        <w:t xml:space="preserve">Review:</w:t>
+      </w:r>
+      <w:r>
+        <w:t xml:space="preserve"> results kept as a short report for review; rerun when chunking or the model changes.</w:t>
+      </w:r>
+    </w:p>
+    <w:p>
+      <w:pPr>
+        <w:pStyle w:val="ListParagraph"/>
+        <w:numPr>
+          <w:ilvl w:val="0"/>
+          <w:numId w:val="7"/>
+        </w:numPr>
+      </w:pPr>
+      <w:r>
+        <w:rPr>
+          <w:b/>
+        </w:rPr>
+        <w:t xml:space="preserve">Command:</w:t>
+      </w:r>
+      <w:r>
+        <w:t xml:space="preserve"> python -m arbitrage_analyser eval-search (add --modes keyword,semantic,hybrid, and --answers to ask the chatbot).</w:t>
+      </w:r>
+    </w:p>
+    <w:p>
+      <w:pPr>
+        <w:pStyle w:val="ListParagraph"/>
+        <w:numPr>
+          <w:ilvl w:val="0"/>
+          <w:numId w:val="7"/>
+        </w:numPr>
+      </w:pPr>
+      <w:r>
+        <w:rPr>
+          <w:b/>
+        </w:rPr>
+        <w:t xml:space="preserve">First run (keyword, 30-Oct-2026, 24 questions):</w:t>
+      </w:r>
+      <w:r>
+        <w:t xml:space="preserve"> answer chunk first 20/21, in top 3 21/21; nothing returned for 2 of 3 not-stated questions. Answers not yet scored (needs a model key).</w:t>
+      </w:r>
+    </w:p>
+    <w:p>
+      <w:pPr>
+        <w:pStyle w:val="ListParagraph"/>
+        <w:numPr>
+          <w:ilvl w:val="0"/>
+          <w:numId w:val="7"/>
+        </w:numPr>
+      </w:pPr>
+      <w:r>
+        <w:rPr>
+          <w:b/>
+        </w:rPr>
+        <w:t xml:space="preserve">Caveat:</w:t>
+      </w:r>
+      <w:r>
+        <w:t xml:space="preserve"> the score threshold was set on this same set; add new questions over time so results are not only on questions it was tuned on.</w:t>
+      </w:r>
+    </w:p>
+    <w:p>
+      <w:pPr/>
+      <w:r>
+        <w:rPr>
+          <w:b/>
+        </w:rPr>
+        <w:t xml:space="preserve">Example questions</w:t>
+      </w:r>
+    </w:p>
+    <w:tbl>
+      <w:tblPr>
+        <w:tblStyle w:val="TableGrid"/>
+        <w:tblW w:w="0" w:type="auto"/>
+        <w:tblLayout w:type="fixed"/>
+        <w:tblLook w:val="04A0" w:firstRow="1" w:lastRow="0" w:firstColumn="0" w:lastColumn="0" w:noHBand="0" w:noVBand="1"/>
+      </w:tblPr>
+      <w:tblGrid>
+        <w:gridCol w:w="3900"/>
+        <w:gridCol w:w="1800"/>
+        <w:gridCol w:w="3660"/>
+      </w:tblGrid>
+      <w:tr>
+        <w:trPr>
+          <w:tblHeader/>
+        </w:trPr>
+        <w:tc>
+          <w:tcPr>
+            <w:tcW w:w="3900" w:type="dxa"/>
+            <w:shd w:val="clear" w:color="auto" w:fill="F2F2F2"/>
+          </w:tcPr>
+          <w:p>
+            <w:pPr/>
+            <w:r>
+              <w:t xml:space="preserve">Question</w:t>
+            </w:r>
+          </w:p>
+        </w:tc>
+        <w:tc>
+          <w:tcPr>
+            <w:tcW w:w="1800" w:type="dxa"/>
+            <w:shd w:val="clear" w:color="auto" w:fill="F2F2F2"/>
+          </w:tcPr>
+          <w:p>
+            <w:pPr/>
+            <w:r>
+              <w:t xml:space="preserve">Type</w:t>
+            </w:r>
+          </w:p>
+        </w:tc>
+        <w:tc>
+          <w:tcPr>
+            <w:tcW w:w="3660" w:type="dxa"/>
+            <w:shd w:val="clear" w:color="auto" w:fill="F2F2F2"/>
+          </w:tcPr>
+          <w:p>
+            <w:pPr/>
+            <w:r>
+              <w:t xml:space="preserve">Truth from the PDF</w:t>
+            </w:r>
+          </w:p>
+        </w:tc>
+      </w:tr>
+      <w:tr>
+        <w:tc>
+          <w:tcPr>
+            <w:tcW w:w="3900" w:type="dxa"/>
+          </w:tcPr>
+          <w:p>
+            <w:pPr/>
+            <w:r>
+              <w:t xml:space="preserve">What was the AUM of Nippon India Arbitrage Fund as of 30-Sep-2026?</w:t>
+            </w:r>
+          </w:p>
+        </w:tc>
+        <w:tc>
+          <w:tcPr>
+            <w:tcW w:w="1800" w:type="dxa"/>
+          </w:tcPr>
+          <w:p>
+            <w:pPr/>
+            <w:r>
+              <w:t xml:space="preserve">Value</w:t>
+            </w:r>
+          </w:p>
+        </w:tc>
+        <w:tc>
+          <w:tcPr>
+            <w:tcW w:w="3660" w:type="dxa"/>
+          </w:tcPr>
+          <w:p>
+            <w:pPr/>
+            <w:r>
+              <w:t xml:space="preserve">Nippon factsheet (Oct 2026), fund page: Rs 17,215.96 Cr</w:t>
+            </w:r>
+          </w:p>
+        </w:tc>
+      </w:tr>
+      <w:tr>
+        <w:tc>
+          <w:tcPr>
+            <w:tcW w:w="3900" w:type="dxa"/>
+          </w:tcPr>
+          <w:p>
+            <w:pPr/>
+            <w:r>
+              <w:t xml:space="preserve">What is Nippon India Arbitrage Fund’s portfolio turnover?</w:t>
+            </w:r>
+          </w:p>
+        </w:tc>
+        <w:tc>
+          <w:tcPr>
+            <w:tcW w:w="1800" w:type="dxa"/>
+          </w:tcPr>
+          <w:p>
+            <w:pPr/>
+            <w:r>
+              <w:t xml:space="preserve">Printed as NA</w:t>
+            </w:r>
+          </w:p>
+        </w:tc>
+        <w:tc>
+          <w:tcPr>
+            <w:tcW w:w="3660" w:type="dxa"/>
+          </w:tcPr>
+          <w:p>
+            <w:pPr/>
+            <w:r>
+              <w:t xml:space="preserve">Same page prints NA; answer must say so, not guess</w:t>
+            </w:r>
+          </w:p>
+        </w:tc>
+      </w:tr>
+      <w:tr>
+        <w:tc>
+          <w:tcPr>
+            <w:tcW w:w="3900" w:type="dxa"/>
+          </w:tcPr>
+          <w:p>
+            <w:pPr/>
+            <w:r>
+              <w:t xml:space="preserve">Does the fund use derivatives?</w:t>
+            </w:r>
+          </w:p>
+        </w:tc>
+        <w:tc>
+          <w:tcPr>
+            <w:tcW w:w="1800" w:type="dxa"/>
+          </w:tcPr>
+          <w:p>
+            <w:pPr/>
+            <w:r>
+              <w:t xml:space="preserve">Yes/no, synonyms</w:t>
+            </w:r>
+          </w:p>
+        </w:tc>
+        <w:tc>
+          <w:tcPr>
+            <w:tcW w:w="3660" w:type="dxa"/>
+          </w:tcPr>
+          <w:p>
+            <w:pPr/>
+            <w:r>
+              <w:t xml:space="preserve">Fund page section on derivatives or hedged equity</w:t>
+            </w:r>
+          </w:p>
+        </w:tc>
+      </w:tr>
+      <w:tr>
+        <w:tc>
+          <w:tcPr>
+            <w:tcW w:w="3900" w:type="dxa"/>
+          </w:tcPr>
+          <w:p>
+            <w:pPr/>
+            <w:r>
+              <w:t xml:space="preserve">What was the fund’s Direct BER in August?</w:t>
+            </w:r>
+          </w:p>
+        </w:tc>
+        <w:tc>
+          <w:tcPr>
+            <w:tcW w:w="1800" w:type="dxa"/>
+          </w:tcPr>
+          <w:p>
+            <w:pPr/>
+            <w:r>
+              <w:t xml:space="preserve">Past month</w:t>
+            </w:r>
+          </w:p>
+        </w:tc>
+        <w:tc>
+          <w:tcPr>
+            <w:tcW w:w="3660" w:type="dxa"/>
+          </w:tcPr>
+          <w:p>
+            <w:pPr/>
+            <w:r>
+              <w:t xml:space="preserve">That month’s factsheet, fund page</w:t>
+            </w:r>
+          </w:p>
+        </w:tc>
+      </w:tr>
+      <w:tr>
+        <w:tc>
+          <w:tcPr>
+            <w:tcW w:w="3900" w:type="dxa"/>
+          </w:tcPr>
+          <w:p>
+            <w:pPr/>
+            <w:r>
+              <w:t xml:space="preserve">Who is the fund’s auditor?</w:t>
+            </w:r>
+          </w:p>
+        </w:tc>
+        <w:tc>
+          <w:tcPr>
+            <w:tcW w:w="1800" w:type="dxa"/>
+          </w:tcPr>
+          <w:p>
+            <w:pPr/>
+            <w:r>
+              <w:t xml:space="preserve">Not in factsheet</w:t>
+            </w:r>
+          </w:p>
+        </w:tc>
+        <w:tc>
+          <w:tcPr>
+            <w:tcW w:w="3660" w:type="dxa"/>
+          </w:tcPr>
+          <w:p>
+            <w:pPr/>
+            <w:r>
+              <w:t xml:space="preserve">Answer: not stated in the factsheet</w:t>
+            </w:r>
+          </w:p>
+        </w:tc>
+      </w:tr>
+    </w:tbl>
+    <w:p>
+      <w:pPr>
+        <w:pStyle w:val="Heading2"/>
+      </w:pPr>
+      <w:r>
         <w:t xml:space="preserve">Out of scope for v0</w:t>
       </w:r>
     </w:p>
@@ -1886,7 +2870,7 @@
         </w:numPr>
       </w:pPr>
       <w:r>
-        <w:t xml:space="preserve">Monthly month-end AUM from factsheets. TER breakdown and quarterly Average AUM are built but switched off for now (config [settings.features]).</w:t>
+        <w:t xml:space="preserve">Factsheet search on portfolio pages (fund page only for now).</w:t>
       </w:r>
     </w:p>
     <w:p>
@@ -1910,7 +2894,7 @@
         </w:numPr>
       </w:pPr>
       <w:r>
-        <w:t xml:space="preserve">External users, login, chatbot.</w:t>
+        <w:t xml:space="preserve">External users, login.</w:t>
       </w:r>
     </w:p>
     <w:p>
@@ -1923,6 +2907,18 @@
       </w:pPr>
       <w:r>
         <w:t xml:space="preserve">Scores or buy recommendations.</w:t>
+      </w:r>
+    </w:p>
+    <w:p>
+      <w:pPr>
+        <w:pStyle w:val="ListParagraph"/>
+        <w:numPr>
+          <w:ilvl w:val="0"/>
+          <w:numId w:val="12"/>
+        </w:numPr>
+      </w:pPr>
+      <w:r>
+        <w:t xml:space="preserve">On hold: total TER from factsheets where AMFI has none; showing “NA” where the factsheet prints NA.</w:t>
       </w:r>
     </w:p>
     <w:sectPr>

</xml_diff>

<commit_message>
Chat history in a hosted Postgres database (Neon), so conversations survive app reboots
- agent/store.py: DATABASE_URL set -> Postgres via a small psycopg connection pool (checked
  connections, no prepared statements for Neon's pooler); else SQLite (data/chat.db) as before.
- Chat tab: shows where chats are saved; if the database cannot be reached, says so and does
  not send the question.
- Tests on SQLite, and on Postgres when TEST_DATABASE_URL is set.
- README, .env.example and spec updated.

Co-Authored-By: Claude Opus 5.5 <noreply@anthropic.com>
Claude-Session: https://claude.ai/code/session_01QNakvTP1ndy176uHZrw6sF
</commit_message>
<xml_diff>
--- a/Arbitrage Fund Analyser – v0 Spec.docx
+++ b/Arbitrage Fund Analyser – v0 Spec.docx
@@ -13,7 +13,7 @@
     <w:p>
       <w:pPr/>
       <w:r>
-        <w:t xml:space="preserve">Oct 7, 2026 · updated Oct 30, 2026 · @Nikhil</w:t>
+        <w:t xml:space="preserve">Oct 7, 2026 · updated Oct 30, 2026 (factsheet search, chat history) · @Nikhil</w:t>
       </w:r>
     </w:p>
     <w:p>
@@ -1771,6 +1771,18 @@
       </w:pPr>
       <w:r>
         <w:t xml:space="preserve">Searches the factsheet text (below) before the first model call; a search_factsheets tool covers other wording, funds or months.</w:t>
+      </w:r>
+    </w:p>
+    <w:p>
+      <w:pPr>
+        <w:pStyle w:val="ListParagraph"/>
+        <w:numPr>
+          <w:ilvl w:val="0"/>
+          <w:numId w:val="9"/>
+        </w:numPr>
+      </w:pPr>
+      <w:r>
+        <w:t xml:space="preserve">Conversations are saved under the name typed in the sidebar and can be reopened. Planned: kept in a hosted database (see Chat history storage).</w:t>
       </w:r>
     </w:p>
     <w:p>
@@ -2125,7 +2137,7 @@
         <w:t xml:space="preserve">Secrets:</w:t>
       </w:r>
       <w:r>
-        <w:t xml:space="preserve"> GITHUB_TOKEN, chatbot model key, Mistral key (for factsheet search).</w:t>
+        <w:t xml:space="preserve"> GITHUB_TOKEN, chatbot model key, Mistral key (optional, for factsheet search), DATABASE_URL (planned, chat history).</w:t>
       </w:r>
     </w:p>
     <w:p>
@@ -2143,7 +2155,7 @@
         <w:t xml:space="preserve">Later:</w:t>
       </w:r>
       <w:r>
-        <w:t xml:space="preserve"> FastAPI over the module when a second consumer appears. Postgres when data or users outgrow CSV files.</w:t>
+        <w:t xml:space="preserve"> fund data moves to the same hosted Postgres database when more fund categories are added. FastAPI over the module when a second consumer appears.</w:t>
       </w:r>
     </w:p>
     <w:p>
@@ -2846,6 +2858,484 @@
         <w:pStyle w:val="Heading2"/>
       </w:pPr>
       <w:r>
+        <w:t xml:space="preserve">Chat history storage (planned)</w:t>
+      </w:r>
+    </w:p>
+    <w:p>
+      <w:pPr/>
+      <w:r>
+        <w:t xml:space="preserve">Conversations must survive app reboots. Today the live app saves them on Streamlit Cloud’s temporary disk, which is wiped when the app reboots, redeploys or sleeps.</w:t>
+      </w:r>
+    </w:p>
+    <w:p>
+      <w:pPr/>
+      <w:r>
+        <w:rPr>
+          <w:b/>
+        </w:rPr>
+        <w:t xml:space="preserve">Requirements</w:t>
+      </w:r>
+    </w:p>
+    <w:p>
+      <w:pPr>
+        <w:pStyle w:val="ListParagraph"/>
+        <w:numPr>
+          <w:ilvl w:val="0"/>
+          <w:numId w:val="7"/>
+        </w:numPr>
+      </w:pPr>
+      <w:r>
+        <w:rPr>
+          <w:b/>
+        </w:rPr>
+        <w:t xml:space="preserve">Database:</w:t>
+      </w:r>
+      <w:r>
+        <w:t xml:space="preserve"> Neon, hosted Postgres, free plan.</w:t>
+      </w:r>
+    </w:p>
+    <w:p>
+      <w:pPr>
+        <w:pStyle w:val="ListParagraph"/>
+        <w:numPr>
+          <w:ilvl w:val="0"/>
+          <w:numId w:val="7"/>
+        </w:numPr>
+      </w:pPr>
+      <w:r>
+        <w:rPr>
+          <w:b/>
+        </w:rPr>
+        <w:t xml:space="preserve">Stored now:</w:t>
+      </w:r>
+      <w:r>
+        <w:t xml:space="preserve"> conversations, messages, feedback (same tables as today).</w:t>
+      </w:r>
+    </w:p>
+    <w:p>
+      <w:pPr>
+        <w:pStyle w:val="ListParagraph"/>
+        <w:numPr>
+          <w:ilvl w:val="0"/>
+          <w:numId w:val="7"/>
+        </w:numPr>
+      </w:pPr>
+      <w:r>
+        <w:rPr>
+          <w:b/>
+        </w:rPr>
+        <w:t xml:space="preserve">Short-term memory:</w:t>
+      </w:r>
+      <w:r>
+        <w:t xml:space="preserve"> each turn reads the conversation’s history from the database; the last 30 messages are sent to the model.</w:t>
+      </w:r>
+    </w:p>
+    <w:p>
+      <w:pPr>
+        <w:pStyle w:val="ListParagraph"/>
+        <w:numPr>
+          <w:ilvl w:val="0"/>
+          <w:numId w:val="7"/>
+        </w:numPr>
+      </w:pPr>
+      <w:r>
+        <w:rPr>
+          <w:b/>
+        </w:rPr>
+        <w:t xml:space="preserve">Fund data:</w:t>
+      </w:r>
+      <w:r>
+        <w:t xml:space="preserve"> stays in CSV files for now; moves to the same database when more fund categories are added.</w:t>
+      </w:r>
+    </w:p>
+    <w:p>
+      <w:pPr>
+        <w:pStyle w:val="ListParagraph"/>
+        <w:numPr>
+          <w:ilvl w:val="0"/>
+          <w:numId w:val="7"/>
+        </w:numPr>
+      </w:pPr>
+      <w:r>
+        <w:rPr>
+          <w:b/>
+        </w:rPr>
+        <w:t xml:space="preserve">Backups:</w:t>
+      </w:r>
+      <w:r>
+        <w:t xml:space="preserve"> Neon’s 6-hour restore is enough; no separate backup.</w:t>
+      </w:r>
+    </w:p>
+    <w:p>
+      <w:pPr/>
+      <w:r>
+        <w:rPr>
+          <w:b/>
+        </w:rPr>
+        <w:t xml:space="preserve">Where chats are saved</w:t>
+      </w:r>
+    </w:p>
+    <w:p>
+      <w:pPr>
+        <w:pStyle w:val="ListParagraph"/>
+        <w:numPr>
+          <w:ilvl w:val="0"/>
+          <w:numId w:val="7"/>
+        </w:numPr>
+      </w:pPr>
+      <w:r>
+        <w:rPr>
+          <w:b/>
+        </w:rPr>
+        <w:t xml:space="preserve">Live app (Streamlit Cloud):</w:t>
+      </w:r>
+      <w:r>
+        <w:t xml:space="preserve"> Neon, through the DATABASE_URL secret.</w:t>
+      </w:r>
+    </w:p>
+    <w:p>
+      <w:pPr>
+        <w:pStyle w:val="ListParagraph"/>
+        <w:numPr>
+          <w:ilvl w:val="0"/>
+          <w:numId w:val="7"/>
+        </w:numPr>
+      </w:pPr>
+      <w:r>
+        <w:rPr>
+          <w:b/>
+        </w:rPr>
+        <w:t xml:space="preserve">App on a laptop:</w:t>
+      </w:r>
+      <w:r>
+        <w:t xml:space="preserve"> data/chat.db on that laptop; Neon if DATABASE_URL is in the local .env.</w:t>
+      </w:r>
+    </w:p>
+    <w:p>
+      <w:pPr>
+        <w:pStyle w:val="ListParagraph"/>
+        <w:numPr>
+          <w:ilvl w:val="0"/>
+          <w:numId w:val="7"/>
+        </w:numPr>
+      </w:pPr>
+      <w:r>
+        <w:rPr>
+          <w:b/>
+        </w:rPr>
+        <w:t xml:space="preserve">Automated tests:</w:t>
+      </w:r>
+      <w:r>
+        <w:t xml:space="preserve"> a temporary SQLite file; never Neon.</w:t>
+      </w:r>
+    </w:p>
+    <w:p>
+      <w:pPr>
+        <w:pStyle w:val="ListParagraph"/>
+        <w:numPr>
+          <w:ilvl w:val="0"/>
+          <w:numId w:val="7"/>
+        </w:numPr>
+      </w:pPr>
+      <w:r>
+        <w:rPr>
+          <w:b/>
+        </w:rPr>
+        <w:t xml:space="preserve">Fund data cache (data/arbitrage.db):</w:t>
+      </w:r>
+      <w:r>
+        <w:t xml:space="preserve"> unchanged; rebuilt from the CSV files when the app starts.</w:t>
+      </w:r>
+    </w:p>
+    <w:p>
+      <w:pPr/>
+      <w:r>
+        <w:rPr>
+          <w:b/>
+        </w:rPr>
+        <w:t xml:space="preserve">Neon free plan (checked 30-Oct-2026 on neon.com/pricing)</w:t>
+      </w:r>
+    </w:p>
+    <w:p>
+      <w:pPr>
+        <w:pStyle w:val="ListParagraph"/>
+        <w:numPr>
+          <w:ilvl w:val="0"/>
+          <w:numId w:val="7"/>
+        </w:numPr>
+      </w:pPr>
+      <w:r>
+        <w:t xml:space="preserve">1 GB storage per project; 100 compute hours per project per month; 5 GB data out.</w:t>
+      </w:r>
+    </w:p>
+    <w:p>
+      <w:pPr>
+        <w:pStyle w:val="ListParagraph"/>
+        <w:numPr>
+          <w:ilvl w:val="0"/>
+          <w:numId w:val="7"/>
+        </w:numPr>
+      </w:pPr>
+      <w:r>
+        <w:t xml:space="preserve">Sleeps after 5 minutes idle and wakes on the next request.</w:t>
+      </w:r>
+    </w:p>
+    <w:p>
+      <w:pPr>
+        <w:pStyle w:val="ListParagraph"/>
+        <w:numPr>
+          <w:ilvl w:val="0"/>
+          <w:numId w:val="7"/>
+        </w:numPr>
+      </w:pPr>
+      <w:r>
+        <w:t xml:space="preserve">Past a limit: stops until the next month; data is not deleted.</w:t>
+      </w:r>
+    </w:p>
+    <w:p>
+      <w:pPr>
+        <w:pStyle w:val="ListParagraph"/>
+        <w:numPr>
+          <w:ilvl w:val="0"/>
+          <w:numId w:val="7"/>
+        </w:numPr>
+      </w:pPr>
+      <w:r>
+        <w:t xml:space="preserve">No India region listed.</w:t>
+      </w:r>
+    </w:p>
+    <w:p>
+      <w:pPr/>
+      <w:r>
+        <w:rPr>
+          <w:b/>
+        </w:rPr>
+        <w:t xml:space="preserve">Challenges and mitigation</w:t>
+      </w:r>
+    </w:p>
+    <w:tbl>
+      <w:tblPr>
+        <w:tblStyle w:val="TableGrid"/>
+        <w:tblW w:w="0" w:type="auto"/>
+        <w:tblLayout w:type="fixed"/>
+        <w:tblLook w:val="04A0" w:firstRow="1" w:lastRow="0" w:firstColumn="0" w:lastColumn="0" w:noHBand="0" w:noVBand="1"/>
+      </w:tblPr>
+      <w:tblGrid>
+        <w:gridCol w:w="4680"/>
+        <w:gridCol w:w="4680"/>
+      </w:tblGrid>
+      <w:tr>
+        <w:trPr>
+          <w:tblHeader/>
+        </w:trPr>
+        <w:tc>
+          <w:tcPr>
+            <w:tcW w:w="4680" w:type="dxa"/>
+            <w:shd w:val="clear" w:color="auto" w:fill="F2F2F2"/>
+          </w:tcPr>
+          <w:p>
+            <w:pPr/>
+            <w:r>
+              <w:t xml:space="preserve">Challenge</w:t>
+            </w:r>
+          </w:p>
+        </w:tc>
+        <w:tc>
+          <w:tcPr>
+            <w:tcW w:w="4680" w:type="dxa"/>
+            <w:shd w:val="clear" w:color="auto" w:fill="F2F2F2"/>
+          </w:tcPr>
+          <w:p>
+            <w:pPr/>
+            <w:r>
+              <w:t xml:space="preserve">Mitigation</w:t>
+            </w:r>
+          </w:p>
+        </w:tc>
+      </w:tr>
+      <w:tr>
+        <w:tc>
+          <w:tcPr>
+            <w:tcW w:w="4680" w:type="dxa"/>
+          </w:tcPr>
+          <w:p>
+            <w:pPr/>
+            <w:r>
+              <w:t xml:space="preserve">Slow first request after the database sleeps</w:t>
+            </w:r>
+          </w:p>
+        </w:tc>
+        <w:tc>
+          <w:tcPr>
+            <w:tcW w:w="4680" w:type="dxa"/>
+          </w:tcPr>
+          <w:p>
+            <w:pPr/>
+            <w:r>
+              <w:t xml:space="preserve">One shared connection; retry once</w:t>
+            </w:r>
+          </w:p>
+        </w:tc>
+      </w:tr>
+      <w:tr>
+        <w:tc>
+          <w:tcPr>
+            <w:tcW w:w="4680" w:type="dxa"/>
+          </w:tcPr>
+          <w:p>
+            <w:pPr/>
+            <w:r>
+              <w:t xml:space="preserve">Too many connections (Streamlit reruns on every click)</w:t>
+            </w:r>
+          </w:p>
+        </w:tc>
+        <w:tc>
+          <w:tcPr>
+            <w:tcW w:w="4680" w:type="dxa"/>
+          </w:tcPr>
+          <w:p>
+            <w:pPr/>
+            <w:r>
+              <w:t xml:space="preserve">Neon’s pooled connection string; one cached connection</w:t>
+            </w:r>
+          </w:p>
+        </w:tc>
+      </w:tr>
+      <w:tr>
+        <w:tc>
+          <w:tcPr>
+            <w:tcW w:w="4680" w:type="dxa"/>
+          </w:tcPr>
+          <w:p>
+            <w:pPr/>
+            <w:r>
+              <w:t xml:space="preserve">Free-plan limits</w:t>
+            </w:r>
+          </w:p>
+        </w:tc>
+        <w:tc>
+          <w:tcPr>
+            <w:tcW w:w="4680" w:type="dxa"/>
+          </w:tcPr>
+          <w:p>
+            <w:pPr/>
+            <w:r>
+              <w:t xml:space="preserve">Usage is small and the database sleeps when idle; check the Neon dashboard monthly</w:t>
+            </w:r>
+          </w:p>
+        </w:tc>
+      </w:tr>
+      <w:tr>
+        <w:tc>
+          <w:tcPr>
+            <w:tcW w:w="4680" w:type="dxa"/>
+          </w:tcPr>
+          <w:p>
+            <w:pPr/>
+            <w:r>
+              <w:t xml:space="preserve">Privacy: chats on a third-party server; no login</w:t>
+            </w:r>
+          </w:p>
+        </w:tc>
+        <w:tc>
+          <w:tcPr>
+            <w:tcW w:w="4680" w:type="dxa"/>
+          </w:tcPr>
+          <w:p>
+            <w:pPr/>
+            <w:r>
+              <w:t xml:space="preserve">No confidential information in chats; login later if needed</w:t>
+            </w:r>
+          </w:p>
+        </w:tc>
+      </w:tr>
+      <w:tr>
+        <w:tc>
+          <w:tcPr>
+            <w:tcW w:w="4680" w:type="dxa"/>
+          </w:tcPr>
+          <w:p>
+            <w:pPr/>
+            <w:r>
+              <w:t xml:space="preserve">Region</w:t>
+            </w:r>
+          </w:p>
+        </w:tc>
+        <w:tc>
+          <w:tcPr>
+            <w:tcW w:w="4680" w:type="dxa"/>
+          </w:tcPr>
+          <w:p>
+            <w:pPr/>
+            <w:r>
+              <w:t xml:space="preserve">Pick a region close to where Streamlit Cloud runs; check at setup</w:t>
+            </w:r>
+          </w:p>
+        </w:tc>
+      </w:tr>
+      <w:tr>
+        <w:tc>
+          <w:tcPr>
+            <w:tcW w:w="4680" w:type="dxa"/>
+          </w:tcPr>
+          <w:p>
+            <w:pPr/>
+            <w:r>
+              <w:t xml:space="preserve">Lock-in</w:t>
+            </w:r>
+          </w:p>
+        </w:tc>
+        <w:tc>
+          <w:tcPr>
+            <w:tcW w:w="4680" w:type="dxa"/>
+          </w:tcPr>
+          <w:p>
+            <w:pPr/>
+            <w:r>
+              <w:t xml:space="preserve">Standard Postgres; moving is a connection-string change plus a data copy</w:t>
+            </w:r>
+          </w:p>
+        </w:tc>
+      </w:tr>
+    </w:tbl>
+    <w:p>
+      <w:pPr/>
+      <w:r>
+        <w:rPr>
+          <w:b/>
+        </w:rPr>
+        <w:t xml:space="preserve">Setup (owner: Nikhil)</w:t>
+      </w:r>
+    </w:p>
+    <w:p>
+      <w:pPr>
+        <w:pStyle w:val="ListParagraph"/>
+        <w:numPr>
+          <w:ilvl w:val="0"/>
+          <w:numId w:val="7"/>
+        </w:numPr>
+      </w:pPr>
+      <w:r>
+        <w:t xml:space="preserve">Create a Neon project; copy the pooled connection string (host name has -pooler).</w:t>
+      </w:r>
+    </w:p>
+    <w:p>
+      <w:pPr>
+        <w:pStyle w:val="ListParagraph"/>
+        <w:numPr>
+          <w:ilvl w:val="0"/>
+          <w:numId w:val="7"/>
+        </w:numPr>
+      </w:pPr>
+      <w:r>
+        <w:t xml:space="preserve">Streamlit Cloud → app → Settings → Secrets: DATABASE_URL = "postgresql://...".</w:t>
+      </w:r>
+    </w:p>
+    <w:p>
+      <w:pPr>
+        <w:pStyle w:val="Heading2"/>
+      </w:pPr>
+      <w:r>
         <w:t xml:space="preserve">Out of scope for v0</w:t>
       </w:r>
     </w:p>
@@ -2895,6 +3385,18 @@
       </w:pPr>
       <w:r>
         <w:t xml:space="preserve">External users, login.</w:t>
+      </w:r>
+    </w:p>
+    <w:p>
+      <w:pPr>
+        <w:pStyle w:val="ListParagraph"/>
+        <w:numPr>
+          <w:ilvl w:val="0"/>
+          <w:numId w:val="12"/>
+        </w:numPr>
+      </w:pPr>
+      <w:r>
+        <w:t xml:space="preserve">Long-term memory: summaries of past conversations, user preferences or patterns.</w:t>
       </w:r>
     </w:p>
     <w:p>

</xml_diff>